<commit_message>
Add defense guide PDF, embed screenshots into report, expand README
- report/generate-guide.js + guide.pdf: 12-page Russian defense companion
  (screenshot checklist, document navigation, MQTT explainer, key code
  excerpts, end-to-end flow walkthrough, 13 anticipated Q&A)
- report/screenshots/: 6 figures (proteus, wokwi, bridge_logs, devtools,
  ui_main, ui_control) — Fig 2.1/2.2/3.2/3.3/4.1/4.2 in report.docx
- report/report.docx rebuilt with embedded screenshots (471 KB → 2.5 MB)
- README: Docker quick-start section, fake-helios mention, report/ + guide
  pointers, build stages 9–11 (Docker, fake firmware, wokwi-cli headless)

Co-Authored-By: Claude Opus 4.7 (1M context) <noreply@anthropic.com>
</commit_message>
<xml_diff>
--- a/report/report.docx
+++ b/report/report.docx
@@ -639,42 +639,48 @@
     </w:p>
     <w:p>
       <w:pPr>
-        <w:pBdr>
-          <w:top w:val="dashed" w:color="AAAAAA" w:sz="6"/>
-          <w:bottom w:val="dashed" w:color="AAAAAA" w:sz="6"/>
-          <w:left w:val="dashed" w:color="AAAAAA" w:sz="6"/>
-          <w:right w:val="dashed" w:color="AAAAAA" w:sz="6"/>
-        </w:pBdr>
-        <w:spacing w:after="60" w:before="240" w:line="240"/>
+        <w:spacing w:after="60" w:before="120"/>
         <w:jc w:val="center"/>
       </w:pPr>
       <w:r>
-        <w:rPr>
-          <w:color w:val="888888"/>
-          <w:sz w:val="24"/>
-          <w:szCs w:val="24"/>
-        </w:rPr>
-        <w:t xml:space="preserve">□ </w:t>
-      </w:r>
-      <w:r>
-        <w:rPr>
-          <w:b/>
-          <w:bCs/>
-          <w:color w:val="AA3333"/>
-          <w:sz w:val="22"/>
-          <w:szCs w:val="22"/>
-        </w:rPr>
-        <w:t xml:space="preserve">ВСТАВИТЬ СКРИНШОТ: </w:t>
-      </w:r>
-      <w:r>
-        <w:rPr>
-          <w:i/>
-          <w:iCs/>
-          <w:color w:val="555555"/>
-          <w:sz w:val="22"/>
-          <w:szCs w:val="22"/>
-        </w:rPr>
-        <w:t xml:space="preserve">Рис. 2.1 — Принципиальная электрическая схема (Proteus 8 Professional)</w:t>
+        <w:drawing>
+          <wp:inline distT="0" distB="0" distL="0" distR="0">
+            <wp:extent cx="5334000" cy="2981325"/>
+            <wp:effectExtent t="0" r="0" b="0" l="0"/>
+            <wp:docPr id="1" name="figure" descr="figure" title="figure"/>
+            <wp:cNvGraphicFramePr>
+              <a:graphicFrameLocks xmlns:a="http://schemas.openxmlformats.org/drawingml/2006/main" noChangeAspect="1"/>
+            </wp:cNvGraphicFramePr>
+            <a:graphic xmlns:a="http://schemas.openxmlformats.org/drawingml/2006/main">
+              <a:graphicData uri="http://schemas.openxmlformats.org/drawingml/2006/picture">
+                <pic:pic xmlns:pic="http://schemas.openxmlformats.org/drawingml/2006/picture">
+                  <pic:nvPicPr>
+                    <pic:cNvPr id="0" name="" descr=""/>
+                    <pic:cNvPicPr>
+                      <a:picLocks noChangeAspect="1" noChangeArrowheads="1"/>
+                    </pic:cNvPicPr>
+                  </pic:nvPicPr>
+                  <pic:blipFill>
+                    <a:blip r:embed="rId9" cstate="none"/>
+                    <a:srcRect/>
+                    <a:stretch>
+                      <a:fillRect/>
+                    </a:stretch>
+                  </pic:blipFill>
+                  <pic:spPr bwMode="auto">
+                    <a:xfrm>
+                      <a:off x="0" y="0"/>
+                      <a:ext cx="5334000" cy="2981325"/>
+                    </a:xfrm>
+                    <a:prstGeom prst="rect">
+                      <a:avLst/>
+                    </a:prstGeom>
+                  </pic:spPr>
+                </pic:pic>
+              </a:graphicData>
+            </a:graphic>
+          </wp:inline>
+        </w:drawing>
       </w:r>
     </w:p>
     <w:p>
@@ -708,42 +714,48 @@
     </w:p>
     <w:p>
       <w:pPr>
-        <w:pBdr>
-          <w:top w:val="dashed" w:color="AAAAAA" w:sz="6"/>
-          <w:bottom w:val="dashed" w:color="AAAAAA" w:sz="6"/>
-          <w:left w:val="dashed" w:color="AAAAAA" w:sz="6"/>
-          <w:right w:val="dashed" w:color="AAAAAA" w:sz="6"/>
-        </w:pBdr>
-        <w:spacing w:after="60" w:before="240" w:line="240"/>
+        <w:spacing w:after="60" w:before="120"/>
         <w:jc w:val="center"/>
       </w:pPr>
       <w:r>
-        <w:rPr>
-          <w:color w:val="888888"/>
-          <w:sz w:val="24"/>
-          <w:szCs w:val="24"/>
-        </w:rPr>
-        <w:t xml:space="preserve">□ </w:t>
-      </w:r>
-      <w:r>
-        <w:rPr>
-          <w:b/>
-          <w:bCs/>
-          <w:color w:val="AA3333"/>
-          <w:sz w:val="22"/>
-          <w:szCs w:val="22"/>
-        </w:rPr>
-        <w:t xml:space="preserve">ВСТАВИТЬ СКРИНШОТ: </w:t>
-      </w:r>
-      <w:r>
-        <w:rPr>
-          <w:i/>
-          <w:iCs/>
-          <w:color w:val="555555"/>
-          <w:sz w:val="22"/>
-          <w:szCs w:val="22"/>
-        </w:rPr>
-        <w:t xml:space="preserve">Рис. 2.2 — Визуализация распайки в Wokwi</w:t>
+        <w:drawing>
+          <wp:inline distT="0" distB="0" distL="0" distR="0">
+            <wp:extent cx="4572000" cy="3705225"/>
+            <wp:effectExtent t="0" r="0" b="0" l="0"/>
+            <wp:docPr id="1" name="figure" descr="figure" title="figure"/>
+            <wp:cNvGraphicFramePr>
+              <a:graphicFrameLocks xmlns:a="http://schemas.openxmlformats.org/drawingml/2006/main" noChangeAspect="1"/>
+            </wp:cNvGraphicFramePr>
+            <a:graphic xmlns:a="http://schemas.openxmlformats.org/drawingml/2006/main">
+              <a:graphicData uri="http://schemas.openxmlformats.org/drawingml/2006/picture">
+                <pic:pic xmlns:pic="http://schemas.openxmlformats.org/drawingml/2006/picture">
+                  <pic:nvPicPr>
+                    <pic:cNvPr id="0" name="" descr=""/>
+                    <pic:cNvPicPr>
+                      <a:picLocks noChangeAspect="1" noChangeArrowheads="1"/>
+                    </pic:cNvPicPr>
+                  </pic:nvPicPr>
+                  <pic:blipFill>
+                    <a:blip r:embed="rId10" cstate="none"/>
+                    <a:srcRect/>
+                    <a:stretch>
+                      <a:fillRect/>
+                    </a:stretch>
+                  </pic:blipFill>
+                  <pic:spPr bwMode="auto">
+                    <a:xfrm>
+                      <a:off x="0" y="0"/>
+                      <a:ext cx="4572000" cy="3705225"/>
+                    </a:xfrm>
+                    <a:prstGeom prst="rect">
+                      <a:avLst/>
+                    </a:prstGeom>
+                  </pic:spPr>
+                </pic:pic>
+              </a:graphicData>
+            </a:graphic>
+          </wp:inline>
+        </w:drawing>
       </w:r>
     </w:p>
     <w:p>
@@ -1527,7 +1539,7 @@
                     </pic:cNvPicPr>
                   </pic:nvPicPr>
                   <pic:blipFill>
-                    <a:blip r:embed="rId9" cstate="none"/>
+                    <a:blip r:embed="rId11" cstate="none"/>
                     <a:srcRect/>
                     <a:stretch>
                       <a:fillRect/>
@@ -5454,42 +5466,48 @@
     </w:p>
     <w:p>
       <w:pPr>
-        <w:pBdr>
-          <w:top w:val="dashed" w:color="AAAAAA" w:sz="6"/>
-          <w:bottom w:val="dashed" w:color="AAAAAA" w:sz="6"/>
-          <w:left w:val="dashed" w:color="AAAAAA" w:sz="6"/>
-          <w:right w:val="dashed" w:color="AAAAAA" w:sz="6"/>
-        </w:pBdr>
-        <w:spacing w:after="60" w:before="240" w:line="240"/>
+        <w:spacing w:after="60" w:before="120"/>
         <w:jc w:val="center"/>
       </w:pPr>
       <w:r>
-        <w:rPr>
-          <w:color w:val="888888"/>
-          <w:sz w:val="24"/>
-          <w:szCs w:val="24"/>
-        </w:rPr>
-        <w:t xml:space="preserve">□ </w:t>
-      </w:r>
-      <w:r>
-        <w:rPr>
-          <w:b/>
-          <w:bCs/>
-          <w:color w:val="AA3333"/>
-          <w:sz w:val="22"/>
-          <w:szCs w:val="22"/>
-        </w:rPr>
-        <w:t xml:space="preserve">ВСТАВИТЬ СКРИНШОТ: </w:t>
-      </w:r>
-      <w:r>
-        <w:rPr>
-          <w:i/>
-          <w:iCs/>
-          <w:color w:val="555555"/>
-          <w:sz w:val="22"/>
-          <w:szCs w:val="22"/>
-        </w:rPr>
-        <w:t xml:space="preserve">Рис. 3.2 — docker logs helios (mqtt connected · device online · WS broadcast)</w:t>
+        <w:drawing>
+          <wp:inline distT="0" distB="0" distL="0" distR="0">
+            <wp:extent cx="5143500" cy="8324850"/>
+            <wp:effectExtent t="0" r="0" b="0" l="0"/>
+            <wp:docPr id="1" name="figure" descr="figure" title="figure"/>
+            <wp:cNvGraphicFramePr>
+              <a:graphicFrameLocks xmlns:a="http://schemas.openxmlformats.org/drawingml/2006/main" noChangeAspect="1"/>
+            </wp:cNvGraphicFramePr>
+            <a:graphic xmlns:a="http://schemas.openxmlformats.org/drawingml/2006/main">
+              <a:graphicData uri="http://schemas.openxmlformats.org/drawingml/2006/picture">
+                <pic:pic xmlns:pic="http://schemas.openxmlformats.org/drawingml/2006/picture">
+                  <pic:nvPicPr>
+                    <pic:cNvPr id="0" name="" descr=""/>
+                    <pic:cNvPicPr>
+                      <a:picLocks noChangeAspect="1" noChangeArrowheads="1"/>
+                    </pic:cNvPicPr>
+                  </pic:nvPicPr>
+                  <pic:blipFill>
+                    <a:blip r:embed="rId12" cstate="none"/>
+                    <a:srcRect/>
+                    <a:stretch>
+                      <a:fillRect/>
+                    </a:stretch>
+                  </pic:blipFill>
+                  <pic:spPr bwMode="auto">
+                    <a:xfrm>
+                      <a:off x="0" y="0"/>
+                      <a:ext cx="5143500" cy="8324850"/>
+                    </a:xfrm>
+                    <a:prstGeom prst="rect">
+                      <a:avLst/>
+                    </a:prstGeom>
+                  </pic:spPr>
+                </pic:pic>
+              </a:graphicData>
+            </a:graphic>
+          </wp:inline>
+        </w:drawing>
       </w:r>
     </w:p>
     <w:p>
@@ -5509,42 +5527,48 @@
     </w:p>
     <w:p>
       <w:pPr>
-        <w:pBdr>
-          <w:top w:val="dashed" w:color="AAAAAA" w:sz="6"/>
-          <w:bottom w:val="dashed" w:color="AAAAAA" w:sz="6"/>
-          <w:left w:val="dashed" w:color="AAAAAA" w:sz="6"/>
-          <w:right w:val="dashed" w:color="AAAAAA" w:sz="6"/>
-        </w:pBdr>
-        <w:spacing w:after="60" w:before="240" w:line="240"/>
+        <w:spacing w:after="60" w:before="120"/>
         <w:jc w:val="center"/>
       </w:pPr>
       <w:r>
-        <w:rPr>
-          <w:color w:val="888888"/>
-          <w:sz w:val="24"/>
-          <w:szCs w:val="24"/>
-        </w:rPr>
-        <w:t xml:space="preserve">□ </w:t>
-      </w:r>
-      <w:r>
-        <w:rPr>
-          <w:b/>
-          <w:bCs/>
-          <w:color w:val="AA3333"/>
-          <w:sz w:val="22"/>
-          <w:szCs w:val="22"/>
-        </w:rPr>
-        <w:t xml:space="preserve">ВСТАВИТЬ СКРИНШОТ: </w:t>
-      </w:r>
-      <w:r>
-        <w:rPr>
-          <w:i/>
-          <w:iCs/>
-          <w:color w:val="555555"/>
-          <w:sz w:val="22"/>
-          <w:szCs w:val="22"/>
-        </w:rPr>
-        <w:t xml:space="preserve">Рис. 3.3 — DevTools Network → WS handshake (101 Switching Protocols)</w:t>
+        <w:drawing>
+          <wp:inline distT="0" distB="0" distL="0" distR="0">
+            <wp:extent cx="5143500" cy="4038600"/>
+            <wp:effectExtent t="0" r="0" b="0" l="0"/>
+            <wp:docPr id="1" name="figure" descr="figure" title="figure"/>
+            <wp:cNvGraphicFramePr>
+              <a:graphicFrameLocks xmlns:a="http://schemas.openxmlformats.org/drawingml/2006/main" noChangeAspect="1"/>
+            </wp:cNvGraphicFramePr>
+            <a:graphic xmlns:a="http://schemas.openxmlformats.org/drawingml/2006/main">
+              <a:graphicData uri="http://schemas.openxmlformats.org/drawingml/2006/picture">
+                <pic:pic xmlns:pic="http://schemas.openxmlformats.org/drawingml/2006/picture">
+                  <pic:nvPicPr>
+                    <pic:cNvPr id="0" name="" descr=""/>
+                    <pic:cNvPicPr>
+                      <a:picLocks noChangeAspect="1" noChangeArrowheads="1"/>
+                    </pic:cNvPicPr>
+                  </pic:nvPicPr>
+                  <pic:blipFill>
+                    <a:blip r:embed="rId13" cstate="none"/>
+                    <a:srcRect/>
+                    <a:stretch>
+                      <a:fillRect/>
+                    </a:stretch>
+                  </pic:blipFill>
+                  <pic:spPr bwMode="auto">
+                    <a:xfrm>
+                      <a:off x="0" y="0"/>
+                      <a:ext cx="5143500" cy="4038600"/>
+                    </a:xfrm>
+                    <a:prstGeom prst="rect">
+                      <a:avLst/>
+                    </a:prstGeom>
+                  </pic:spPr>
+                </pic:pic>
+              </a:graphicData>
+            </a:graphic>
+          </wp:inline>
+        </w:drawing>
       </w:r>
     </w:p>
     <w:p>
@@ -5713,42 +5737,48 @@
     </w:p>
     <w:p>
       <w:pPr>
-        <w:pBdr>
-          <w:top w:val="dashed" w:color="AAAAAA" w:sz="6"/>
-          <w:bottom w:val="dashed" w:color="AAAAAA" w:sz="6"/>
-          <w:left w:val="dashed" w:color="AAAAAA" w:sz="6"/>
-          <w:right w:val="dashed" w:color="AAAAAA" w:sz="6"/>
-        </w:pBdr>
-        <w:spacing w:after="60" w:before="240" w:line="240"/>
+        <w:spacing w:after="60" w:before="120"/>
         <w:jc w:val="center"/>
       </w:pPr>
       <w:r>
-        <w:rPr>
-          <w:color w:val="888888"/>
-          <w:sz w:val="24"/>
-          <w:szCs w:val="24"/>
-        </w:rPr>
-        <w:t xml:space="preserve">□ </w:t>
-      </w:r>
-      <w:r>
-        <w:rPr>
-          <w:b/>
-          <w:bCs/>
-          <w:color w:val="AA3333"/>
-          <w:sz w:val="22"/>
-          <w:szCs w:val="22"/>
-        </w:rPr>
-        <w:t xml:space="preserve">ВСТАВИТЬ СКРИНШОТ: </w:t>
-      </w:r>
-      <w:r>
-        <w:rPr>
-          <w:i/>
-          <w:iCs/>
-          <w:color w:val="555555"/>
-          <w:sz w:val="22"/>
-          <w:szCs w:val="22"/>
-        </w:rPr>
-        <w:t xml:space="preserve">Рис. 4.1 — Скриншот рабочего веб-дашборда (3D-модель + графики + sensor cards)</w:t>
+        <w:drawing>
+          <wp:inline distT="0" distB="0" distL="0" distR="0">
+            <wp:extent cx="5524500" cy="2867025"/>
+            <wp:effectExtent t="0" r="0" b="0" l="0"/>
+            <wp:docPr id="1" name="figure" descr="figure" title="figure"/>
+            <wp:cNvGraphicFramePr>
+              <a:graphicFrameLocks xmlns:a="http://schemas.openxmlformats.org/drawingml/2006/main" noChangeAspect="1"/>
+            </wp:cNvGraphicFramePr>
+            <a:graphic xmlns:a="http://schemas.openxmlformats.org/drawingml/2006/main">
+              <a:graphicData uri="http://schemas.openxmlformats.org/drawingml/2006/picture">
+                <pic:pic xmlns:pic="http://schemas.openxmlformats.org/drawingml/2006/picture">
+                  <pic:nvPicPr>
+                    <pic:cNvPr id="0" name="" descr=""/>
+                    <pic:cNvPicPr>
+                      <a:picLocks noChangeAspect="1" noChangeArrowheads="1"/>
+                    </pic:cNvPicPr>
+                  </pic:nvPicPr>
+                  <pic:blipFill>
+                    <a:blip r:embed="rId14" cstate="none"/>
+                    <a:srcRect/>
+                    <a:stretch>
+                      <a:fillRect/>
+                    </a:stretch>
+                  </pic:blipFill>
+                  <pic:spPr bwMode="auto">
+                    <a:xfrm>
+                      <a:off x="0" y="0"/>
+                      <a:ext cx="5524500" cy="2867025"/>
+                    </a:xfrm>
+                    <a:prstGeom prst="rect">
+                      <a:avLst/>
+                    </a:prstGeom>
+                  </pic:spPr>
+                </pic:pic>
+              </a:graphicData>
+            </a:graphic>
+          </wp:inline>
+        </w:drawing>
       </w:r>
     </w:p>
     <w:p>
@@ -5768,42 +5798,48 @@
     </w:p>
     <w:p>
       <w:pPr>
-        <w:pBdr>
-          <w:top w:val="dashed" w:color="AAAAAA" w:sz="6"/>
-          <w:bottom w:val="dashed" w:color="AAAAAA" w:sz="6"/>
-          <w:left w:val="dashed" w:color="AAAAAA" w:sz="6"/>
-          <w:right w:val="dashed" w:color="AAAAAA" w:sz="6"/>
-        </w:pBdr>
-        <w:spacing w:after="60" w:before="240" w:line="240"/>
+        <w:spacing w:after="60" w:before="120"/>
         <w:jc w:val="center"/>
       </w:pPr>
       <w:r>
-        <w:rPr>
-          <w:color w:val="888888"/>
-          <w:sz w:val="24"/>
-          <w:szCs w:val="24"/>
-        </w:rPr>
-        <w:t xml:space="preserve">□ </w:t>
-      </w:r>
-      <w:r>
-        <w:rPr>
-          <w:b/>
-          <w:bCs/>
-          <w:color w:val="AA3333"/>
-          <w:sz w:val="22"/>
-          <w:szCs w:val="22"/>
-        </w:rPr>
-        <w:t xml:space="preserve">ВСТАВИТЬ СКРИНШОТ: </w:t>
-      </w:r>
-      <w:r>
-        <w:rPr>
-          <w:i/>
-          <w:iCs/>
-          <w:color w:val="555555"/>
-          <w:sz w:val="22"/>
-          <w:szCs w:val="22"/>
-        </w:rPr>
-        <w:t xml:space="preserve">Рис. 4.2 — Control Panel в режиме MANUAL с двинутым azimuth-слайдером</w:t>
+        <w:drawing>
+          <wp:inline distT="0" distB="0" distL="0" distR="0">
+            <wp:extent cx="4381500" cy="2495550"/>
+            <wp:effectExtent t="0" r="0" b="0" l="0"/>
+            <wp:docPr id="1" name="figure" descr="figure" title="figure"/>
+            <wp:cNvGraphicFramePr>
+              <a:graphicFrameLocks xmlns:a="http://schemas.openxmlformats.org/drawingml/2006/main" noChangeAspect="1"/>
+            </wp:cNvGraphicFramePr>
+            <a:graphic xmlns:a="http://schemas.openxmlformats.org/drawingml/2006/main">
+              <a:graphicData uri="http://schemas.openxmlformats.org/drawingml/2006/picture">
+                <pic:pic xmlns:pic="http://schemas.openxmlformats.org/drawingml/2006/picture">
+                  <pic:nvPicPr>
+                    <pic:cNvPr id="0" name="" descr=""/>
+                    <pic:cNvPicPr>
+                      <a:picLocks noChangeAspect="1" noChangeArrowheads="1"/>
+                    </pic:cNvPicPr>
+                  </pic:nvPicPr>
+                  <pic:blipFill>
+                    <a:blip r:embed="rId15" cstate="none"/>
+                    <a:srcRect/>
+                    <a:stretch>
+                      <a:fillRect/>
+                    </a:stretch>
+                  </pic:blipFill>
+                  <pic:spPr bwMode="auto">
+                    <a:xfrm>
+                      <a:off x="0" y="0"/>
+                      <a:ext cx="4381500" cy="2495550"/>
+                    </a:xfrm>
+                    <a:prstGeom prst="rect">
+                      <a:avLst/>
+                    </a:prstGeom>
+                  </pic:spPr>
+                </pic:pic>
+              </a:graphicData>
+            </a:graphic>
+          </wp:inline>
+        </w:drawing>
       </w:r>
     </w:p>
     <w:p>

</xml_diff>